<commit_message>
Preservar formato y estilos en plantillas Word in-place, soporte de fuentes adyacentes y actualizacion general
</commit_message>
<xml_diff>
--- a/Proyectos_Correspondencia/Correspondencia_Oficial_Demo/Plantilla_Notificacion_Oficial.docx
+++ b/Proyectos_Correspondencia/Correspondencia_Oficial_Demo/Plantilla_Notificacion_Oficial.docx
@@ -3,41 +3,18 @@
 <w:document xmlns:wpc="http://schemas.microsoft.com/office/word/2010/wordprocessingCanvas" xmlns:mo="http://schemas.microsoft.com/office/mac/office/2008/main" xmlns:mc="http://schemas.openxmlformats.org/markup-compatibility/2006" xmlns:mv="urn:schemas-microsoft-com:mac:vml" xmlns:o="urn:schemas-microsoft-com:office:office" xmlns:r="http://schemas.openxmlformats.org/officeDocument/2006/relationships" xmlns:m="http://schemas.openxmlformats.org/officeDocument/2006/math" xmlns:v="urn:schemas-microsoft-com:vml" xmlns:wp14="http://schemas.microsoft.com/office/word/2010/wordprocessingDrawing" xmlns:wp="http://schemas.openxmlformats.org/drawingml/2006/wordprocessingDrawing" xmlns:w10="urn:schemas-microsoft-com:office:word" xmlns:w="http://schemas.openxmlformats.org/wordprocessingml/2006/main" xmlns:w14="http://schemas.microsoft.com/office/word/2010/wordml" xmlns:wpg="http://schemas.microsoft.com/office/word/2010/wordprocessingGroup" xmlns:wpi="http://schemas.microsoft.com/office/word/2010/wordprocessingInk" xmlns:wne="http://schemas.microsoft.com/office/word/2006/wordml" xmlns:wps="http://schemas.microsoft.com/office/word/2010/wordprocessingShape" mc:Ignorable="w14 wp14">
   <w:body>
     <w:p>
-      <w:pPr>
-        <w:pStyle w:val="Heading1"/>
-      </w:pPr>
       <w:r>
-        <w:t>NOTIFICACIÓN OFICIAL DE REQUERIMIENTO</w:t>
-      </w:r>
-    </w:p>
-    <w:p>
-      <w:r>
-        <w:t>Fecha:   {{ Fecha }}</w:t>
-      </w:r>
-    </w:p>
-    <w:p>
-      <w:r>
-        <w:t>Estimado(a)   {{ Nombre }}  ,  {{ Cargo }}   -   {{ Empresa }}</w:t>
-      </w:r>
-    </w:p>
-    <w:p>
-      <w:r>
-        <w:t>Por medio de la presente, le notificamos {{ Cargo }}  {{ Cargo }}  {{ Cargo }}  oficialmente el estado de su trámite por un importe de   {{ Monto }}  .</w:t>
-      </w:r>
-    </w:p>
-    <w:p>
-      <w:r>
-        <w:t>Quedamos a su disposición ante cualquier duda a través de su correo:   {{ Email }}  .</w:t>
-      </w:r>
-    </w:p>
-    <w:p>
-      <w:r>
-        <w:t>Atentamente,Dirección Genera {{ Empresa }}  {{ Empresa }}  {{ Empresa }} l</w:t>
+        <w:rPr>
+          <w:b w:val="0"/>
+          <w:i w:val="0"/>
+          <w:u w:val="none"/>
+        </w:rPr>
+        <w:t>Contenido con html</w:t>
       </w:r>
     </w:p>
     <w:sectPr>
       <w:pgSz w:w="12240" w:h="15840"/>
-      <w:pgMar w:top="1440" w:right="1800" w:bottom="1440" w:left="1800" w:header="720" w:footer="720" w:gutter="0"/>
+      <w:pgMar w:top="1440" w:right="1440" w:bottom="1440" w:left="1440" w:header="720" w:footer="720" w:gutter="0"/>
       <w:cols w:space="720"/>
       <w:docGrid w:linePitch="360"/>
     </w:sectPr>

</xml_diff>